<commit_message>
Publish final Lab1 report and 17-slide presentation
</commit_message>
<xml_diff>
--- a/report/台灣房屋銷售價格預測挑戰賽_正式報告.docx
+++ b/report/台灣房屋銷售價格預測挑戰賽_正式報告.docx
@@ -9669,7 +9669,7 @@
         <w:rPr>
           <w:b w:val="0"/>
         </w:rPr>
-        <w:t>流程結合資料清理、不同價格學習方式、歷史參考與固定組合，再用時間驗證檢查未知交易。目前只觀察到小幅改善，不同年份與群體結果不一致，Private未知。下一步用尚未參與選型的較晚交易，以及不同隨機起點重訓，確認穩定性。</w:t>
+        <w:t>流程結合資料清理、不同價格學習方式、歷史參考與固定組合，再用時間驗證檢查未知交易。不同年份與群體的離線結果不一致；最終提交的私人排行榜（Private）總價MAE為1,876,025.5730元。[5] 未來可用尚未參與選型的較晚交易，以及不同隨機起點重訓，確認穩定性。</w:t>
       </w:r>
     </w:p>
     <w:p>
@@ -9685,7 +9685,7 @@
         <w:rPr>
           <w:b w:val="0"/>
         </w:rPr>
-        <w:t>另一對照方法在原三期整體及固定加權離線指標都優於基準，Public卻為2,083,045.2932元，反而較差；它在最早及最近年度的離線MAE也優於最終方法。這表示歷史驗證無法保證平台表現，不能只保留支持最終方法的比較。</w:t>
+        <w:t>另一對照方法在原三期整體及固定加權離線指標都優於基準，當時的公開榜表現卻反而較差；它在最早及最近年度的離線MAE也優於最終方法。這表示歷史驗證無法保證平台表現，不能只保留支持最終方法的比較。</w:t>
       </w:r>
     </w:p>
     <w:p>
@@ -9734,33 +9734,6 @@
           <w:b w:val="0"/>
         </w:rPr>
         <w:t>每次參考單價神經網路只用一個隨機起點（seed）；基準讀取保存結果，沒有同期重訓完全匹配的對照。小幅差異不能全歸因於訓練損失的改動，也未涵蓋GPU重訓時的數值變動。</w:t>
-      </w:r>
-    </w:p>
-    <w:p>
-      <w:pPr>
-        <w:pStyle w:val="Heading2"/>
-        <w:keepNext/>
-        <w:keepLines/>
-        <w:pageBreakBefore w:val="0"/>
-      </w:pPr>
-      <w:r>
-        <w:t>8.4 最終訓練與重現範圍</w:t>
-      </w:r>
-    </w:p>
-    <w:p>
-      <w:r>
-        <w:rPr>
-          <w:b w:val="0"/>
-        </w:rPr>
-        <w:t>最終使用467,221筆有答案交易，只新訓練參考單價網路，其餘五模型沿用保存預測。[6] 後續在同機既有及重新獨立安裝的軟體環境，載入六模型與轉換規則重做估價；47,073筆的13組預測向量與答案檔皆一致。預測向量是按交易順序排列的數值清單，此處沒有重訓。[9]</w:t>
-      </w:r>
-    </w:p>
-    <w:p>
-      <w:pPr>
-        <w:keepNext w:val="0"/>
-      </w:pPr>
-      <w:r>
-        <w:t>目前已完成保存模型的推論核對；從原始資料完整重訓六模型仍未驗證。[9]</w:t>
       </w:r>
     </w:p>
     <w:p>
@@ -9831,7 +9804,7 @@
           <w:b w:val="0"/>
           <w:sz w:val="19"/>
         </w:rPr>
-        <w:t>[5] 最終選定、使用者公開分數回報與本次平台頁面核對。</w:t>
+        <w:t>[5] 最終選定與私人排行榜成績（使用者提供）。</w:t>
       </w:r>
     </w:p>
     <w:p>

</xml_diff>